<commit_message>
docs: update repository url to Machine-Learning-Development-Plan
</commit_message>
<xml_diff>
--- a/docs/Machine_Learning_Model_Development_Plan_Week_3.docx
+++ b/docs/Machine_Learning_Model_Development_Plan_Week_3.docx
@@ -84,7 +84,7 @@
                 <w:color w:val="10B981"/>
                 <w:sz w:val="19"/>
               </w:rPr>
-              <w:t>Compulsory Project Repository: https://github.com/sumarjanabiswas/Machine-Learning-Development-Plan-Week3</w:t>
+              <w:t>Compulsory Project Repository: https://github.com/sumarjanabiswas/Machine-Learning-Development-Plan</w:t>
             </w:r>
           </w:p>
         </w:tc>
@@ -279,7 +279,7 @@
                 <w:color w:val="0284C7"/>
                 <w:sz w:val="19"/>
               </w:rPr>
-              <w:t>https://github.com/sumarjanabiswas/Machine-Learning-Development-Plan-Week3</w:t>
+              <w:t>https://github.com/sumarjanabiswas/Machine-Learning-Development-Plan</w:t>
             </w:r>
           </w:p>
         </w:tc>
@@ -9397,7 +9397,7 @@
         <w:color w:val="94A3B8"/>
         <w:sz w:val="17"/>
       </w:rPr>
-      <w:t>GitHub Repository: https://github.com/sumarjanabiswas/Machine-Learning-Development-Plan-Week3  |  sumarjanabiswas690@gmail.com</w:t>
+      <w:t>GitHub Repository: https://github.com/sumarjanabiswas/Machine-Learning-Development-Plan  |  sumarjanabiswas690@gmail.com</w:t>
     </w:r>
   </w:p>
 </w:ftr>

</xml_diff>

<commit_message>
fix: capitalize Sumarjanabiswas in repository url
</commit_message>
<xml_diff>
--- a/docs/Machine_Learning_Model_Development_Plan_Week_3.docx
+++ b/docs/Machine_Learning_Model_Development_Plan_Week_3.docx
@@ -84,7 +84,7 @@
                 <w:color w:val="10B981"/>
                 <w:sz w:val="19"/>
               </w:rPr>
-              <w:t>Compulsory Project Repository: https://github.com/sumarjanabiswas/Machine-Learning-Development-Plan</w:t>
+              <w:t>Compulsory Project Repository: https://github.com/Sumarjanabiswas/Machine-Learning-Development-Plan</w:t>
             </w:r>
           </w:p>
         </w:tc>
@@ -279,7 +279,7 @@
                 <w:color w:val="0284C7"/>
                 <w:sz w:val="19"/>
               </w:rPr>
-              <w:t>https://github.com/sumarjanabiswas/Machine-Learning-Development-Plan</w:t>
+              <w:t>https://github.com/Sumarjanabiswas/Machine-Learning-Development-Plan</w:t>
             </w:r>
           </w:p>
         </w:tc>
@@ -9397,7 +9397,7 @@
         <w:color w:val="94A3B8"/>
         <w:sz w:val="17"/>
       </w:rPr>
-      <w:t>GitHub Repository: https://github.com/sumarjanabiswas/Machine-Learning-Development-Plan  |  sumarjanabiswas690@gmail.com</w:t>
+      <w:t>GitHub Repository: https://github.com/Sumarjanabiswas/Machine-Learning-Development-Plan  |  sumarjanabiswas690@gmail.com</w:t>
     </w:r>
   </w:p>
 </w:ftr>

</xml_diff>